<commit_message>
Final simulation results and regenerated manuscript/tables/figures
Run complete: phase1 (50 sims), sensitivity (30 sims), non-linearity (30 sims), real-data. Summary CSVs, manuscript, tables and figures regenerated from the full results with no hard-coded numbers.

Co-Authored-By: Tatsuki Onishi <bougtoir@gmail.com>
</commit_message>
<xml_diff>
--- a/results/manuscript/IONE_revised_manuscript.docx
+++ b/results/manuscript/IONE_revised_manuscript.docx
@@ -42,7 +42,7 @@
     </w:p>
     <w:p>
       <w:r>
-        <w:t>Background. Observational treatment-effect estimates can be distorted by hidden effect modification and confounding. We propose two exploratory coherence diagnostics—C1 (between-stratum heterogeneity of treatment effects) and W (within-stratum homogeneity of conditional average treatment effects)—and benchmark stratification-based extraction in a simulation with explicit confounding and effect modification. Methods. Data were generated for a binary treatment, binary outcome and measured covariates carrying traces of an unmeasured confounder/modifier. We compared four proposed IONE methods, six PCA variants, three active comparators (propensity-score quintiles, Gaussian mixture model, prognostic-score stratification) and two oracle baselines. Discovery/evaluation splitting was used for all outcome-informed methods. The estimand was the population risk-difference ATE; performance was measured by ARI with the true Z partition, C1, W and ATE bias reduction. Results. In the primary scenario (n=2000, K=5), extraction performance was modest (best ARI = 0.032). Bias reduction was also modest: the best absolute reduction was 0.00758 (relative 0.418), from a crude absolute bias of 0.01816 to a stratified absolute bias of 0.01057, achieved by 1B_residual. Outcome-free methods were more stable, while residual-based outcome-informed methods showed larger W but required sample splitting to avoid circularity. Sensitivity analyses showed that stronger Z→X traces and larger sample sizes improved both diagnostics and bias reduction; non-linear Z→X mappings degraded PCA but not clustering-based methods. Semi-synthetic illustrations of Simpson's paradox showed high ARI only when pseudo-general variables were strongly correlated with the known confounder. Conclusions. IONE provides transparent, exploratory diagnostics for hidden population structure, but extraction remains conditional and modest. It should be used as a sensitivity complement to, not a replacement for, established causal-inference methods.</w:t>
+        <w:t>Background. Observational treatment-effect estimates can be distorted by hidden effect modification and confounding. We propose two exploratory coherence diagnostics—C1 (between-stratum heterogeneity) and W (within-stratum CATE homogeneity)—and benchmark stratification-based extraction in a simulation with explicit confounding and effect modification. Methods. We generated binary treatment and outcome data with measured covariates carrying traces of an unmeasured confounder/modifier, and compared four proposed IONE methods, six PCA variants, three active comparators and two oracle baselines. Outcome-informed methods used a 50/50 discovery/evaluation split. The estimand was the population risk-difference ATE; performance was measured by ARI, C1, W and ATE bias reduction. Results. In the primary scenario (n=2000, K=5), extraction was modest (best ARI = 0.032). Bias reduction was also modest: the best absolute reduction was 0.00758 (relative 0.418), from a crude absolute bias of 0.01816 to a stratified absolute bias of 0.01057, achieved by 1B_residual. Sensitivity analyses showed that stronger Z→X traces and larger sample sizes improved diagnostics and bias reduction; non-linear Z→X mappings degraded PCA but not clustering-based methods. Semi-synthetic illustrations showed high ARI only when pseudo-variables strongly correlated with the known confounder. Conclusions. IONE provides transparent, exploratory diagnostics for hidden population structure, but extraction remains conditional and modest. It should be used as a sensitivity complement to established causal-inference methods.</w:t>
       </w:r>
     </w:p>
     <w:p/>
@@ -1952,7 +1952,7 @@
       <w:r>
         <w:drawing>
           <wp:inline xmlns:a="http://schemas.openxmlformats.org/drawingml/2006/main" xmlns:pic="http://schemas.openxmlformats.org/drawingml/2006/picture">
-            <wp:extent cx="5303520" cy="2410691"/>
+            <wp:extent cx="5303520" cy="2651760"/>
             <wp:docPr id="2" name="Picture 2"/>
             <wp:cNvGraphicFramePr>
               <a:graphicFrameLocks noChangeAspect="1"/>
@@ -1961,7 +1961,7 @@
               <a:graphicData uri="http://schemas.openxmlformats.org/drawingml/2006/picture">
                 <pic:pic>
                   <pic:nvPicPr>
-                    <pic:cNvPr id="0" name="fig3_real_data_ari.png"/>
+                    <pic:cNvPr id="0" name="fig2_sensitivity_bias.png"/>
                     <pic:cNvPicPr/>
                   </pic:nvPicPr>
                   <pic:blipFill>
@@ -1973,7 +1973,7 @@
                   <pic:spPr>
                     <a:xfrm>
                       <a:off x="0" y="0"/>
-                      <a:ext cx="5303520" cy="2410691"/>
+                      <a:ext cx="5303520" cy="2651760"/>
                     </a:xfrm>
                     <a:prstGeom prst="rect"/>
                   </pic:spPr>
@@ -1992,7 +1992,7 @@
         <w:rPr>
           <w:b/>
         </w:rPr>
-        <w:t>Figure 3. Real-data ARI by dataset and method.</w:t>
+        <w:t>Figure 2. Sensitivity of bias reduction to Z→X influence.</w:t>
       </w:r>
     </w:p>
     <w:p/>
@@ -2514,6 +2514,54 @@
     </w:p>
     <w:p/>
     <w:p>
+      <w:r>
+        <w:drawing>
+          <wp:inline xmlns:a="http://schemas.openxmlformats.org/drawingml/2006/main" xmlns:pic="http://schemas.openxmlformats.org/drawingml/2006/picture">
+            <wp:extent cx="5303520" cy="2410691"/>
+            <wp:docPr id="3" name="Picture 3"/>
+            <wp:cNvGraphicFramePr>
+              <a:graphicFrameLocks noChangeAspect="1"/>
+            </wp:cNvGraphicFramePr>
+            <a:graphic>
+              <a:graphicData uri="http://schemas.openxmlformats.org/drawingml/2006/picture">
+                <pic:pic>
+                  <pic:nvPicPr>
+                    <pic:cNvPr id="0" name="fig3_real_data_ari.png"/>
+                    <pic:cNvPicPr/>
+                  </pic:nvPicPr>
+                  <pic:blipFill>
+                    <a:blip r:embed="rId11"/>
+                    <a:stretch>
+                      <a:fillRect/>
+                    </a:stretch>
+                  </pic:blipFill>
+                  <pic:spPr>
+                    <a:xfrm>
+                      <a:off x="0" y="0"/>
+                      <a:ext cx="5303520" cy="2410691"/>
+                    </a:xfrm>
+                    <a:prstGeom prst="rect"/>
+                  </pic:spPr>
+                </pic:pic>
+              </a:graphicData>
+            </a:graphic>
+          </wp:inline>
+        </w:drawing>
+      </w:r>
+    </w:p>
+    <w:p>
+      <w:pPr>
+        <w:jc w:val="center"/>
+      </w:pPr>
+      <w:r>
+        <w:rPr>
+          <w:b/>
+        </w:rPr>
+        <w:t>Figure 3. Real-data ARI by dataset and method.</w:t>
+      </w:r>
+    </w:p>
+    <w:p/>
+    <w:p>
       <w:pPr>
         <w:pStyle w:val="Heading1"/>
       </w:pPr>

</xml_diff>

<commit_message>
Fix Vancouver citation order, remove orphan refs, update Morris URL, and tighten Discussion language
Co-Authored-By: Tatsuki Onishi <bougtoir@gmail.com>
</commit_message>
<xml_diff>
--- a/results/manuscript/IONE_revised_manuscript.docx
+++ b/results/manuscript/IONE_revised_manuscript.docx
@@ -76,6 +76,15 @@
         <w:t>1</w:t>
       </w:r>
       <w:r>
+        <w:t>. We frame the problem with the counterfactual (potential-outcomes) model</w:t>
+      </w:r>
+      <w:r>
+        <w:rPr>
+          <w:vertAlign w:val="superscript"/>
+        </w:rPr>
+        <w:t>2</w:t>
+      </w:r>
+      <w:r>
         <w:t>. When a population is composed of subgroups with different treatment effects or different confounding structures, a marginal estimate can be non-robust or even qualitatively wrong (Simpson's paradox)</w:t>
       </w:r>
       <w:r>
@@ -91,7 +100,7 @@
         <w:rPr>
           <w:vertAlign w:val="superscript"/>
         </w:rPr>
-        <w:t>5</w:t>
+        <w:t>4</w:t>
       </w:r>
       <w:r>
         <w:t>, but to provide an exploratory diagnostic that warns analysts when a population may be incoherent and that suggests where subgroup-specific analysis may be warranted.</w:t>
@@ -121,7 +130,7 @@
         <w:rPr>
           <w:vertAlign w:val="superscript"/>
         </w:rPr>
-        <w:t>2</w:t>
+        <w:t>5</w:t>
       </w:r>
       <w:r>
         <w:t>. The population risk-difference ATE is computed by averaging the true individual CATE over the simulated super-population. Default parameters were calibrated so that the crude marginal risk difference is on the order of 0.02 and the true ATE is on the order of 0.01, reflecting a realistic low-to-moderate confounding scenario. Sensitivity analyses vary sample size (500, 2000, 10000), Z→Y strength, Z→X influence, number of strata (3, 5, 10), and non-linear Z→X mappings.</w:t>
@@ -2012,24 +2021,24 @@
         <w:rPr>
           <w:vertAlign w:val="superscript"/>
         </w:rPr>
-        <w:t>8</w:t>
+        <w:t>6</w:t>
       </w:r>
       <w:r/>
       <w:r>
         <w:rPr>
           <w:vertAlign w:val="superscript"/>
         </w:rPr>
-        <w:t>9</w:t>
+        <w:t>7</w:t>
       </w:r>
       <w:r/>
       <w:r>
         <w:rPr>
           <w:vertAlign w:val="superscript"/>
         </w:rPr>
-        <w:t>10</w:t>
+        <w:t>8</w:t>
       </w:r>
       <w:r>
-        <w:t>. High ARI was obtained only when the pseudo-variables were strongly correlated with a low-dimensional confounder (kidney stone, Israeli vaccine). Multi-level confounders produced near-zero ARI (UC Berkeley, COVID-19 CFR). These examples are illustrations of favourable vs. unfavourable settings, not validation of out-of-the-box performance. Figure 3 summarises ARI across datasets.</w:t>
+        <w:t>. High ARI was obtained only when the pseudo-variables were strongly correlated with a low-dimensional confounder (kidney stone, Israeli vaccine). Multi-level confounders produced near-zero ARI (UC Berkeley, COVID-19 CFR). Table 2 gives the best-performing method and stratum count for each dataset, and Figure 3 summarises ARI across all datasets. These examples are illustrations of favourable vs. unfavourable settings, not validation of out-of-the-box performance.</w:t>
       </w:r>
     </w:p>
     <w:tbl>
@@ -2571,7 +2580,16 @@
     </w:p>
     <w:p>
       <w:r>
-        <w:t>This study reframes IONE as an exploratory diagnostic-sensitivity tool rather than a mature two-stage workflow. The simulations show that hidden population structure can sometimes be detected and partially corrected, but success is strongly conditional on the confounder leaving strong traces in measured variables and on a simple, low-dimensional hidden structure. Outcome-informed methods can capitalise on outcome heterogeneity but require sample splitting to avoid overfitting and induced bias; outcome-free methods are more robust but lack the outcome signal. C1 and W provide transparent diagnostics, but they are not calibrated decision rules and should not replace propensity-score or regression adjustment. Limitations include the stylised DGM, the constructed nature of the true-Z partition, and the absence of a real individual-level cohort. Future work should calibrate C1/W thresholds on individual-level clinical data and compare IONE with latent-class and mixture-model approaches.</w:t>
+        <w:t>We position IONE as an exploratory diagnostic-sensitivity tool, not as a complete causal-inference workflow. The simulations show that hidden population structure can sometimes be detected and that stratified estimates can have smaller ATE bias in some scenarios, but success is strongly conditional on the confounder leaving strong traces in measured variables and on a simple, low-dimensional hidden structure. Outcome-informed methods can capitalise on outcome heterogeneity but require sample splitting to avoid overfitting and induced bias; outcome-free methods are more robust but lack the outcome signal. C1 and W provide transparent diagnostics, but they are not calibrated decision rules and should not replace propensity-score or regression adjustment or more comprehensive causal-inference methods</w:t>
+      </w:r>
+      <w:r>
+        <w:rPr>
+          <w:vertAlign w:val="superscript"/>
+        </w:rPr>
+        <w:t>9</w:t>
+      </w:r>
+      <w:r>
+        <w:t>. Limitations include the stylised DGM, the constructed nature of the true-Z partition, and the absence of a real individual-level cohort. Future work should calibrate C1/W thresholds on individual-level clinical data and compare IONE with latent-class and mixture-model approaches.</w:t>
       </w:r>
     </w:p>
     <w:p>
@@ -2614,7 +2632,7 @@
         <w:t xml:space="preserve">2. </w:t>
       </w:r>
       <w:r>
-        <w:t>VanderWeele TJ. Explanation in Causal Inference: Methods for Mediation and Interaction. Oxford University Press; 2015.</w:t>
+        <w:t>Rubin DB. Estimating causal effects of treatments in randomized and nonrandomized studies. J Educ Psychol. 1974;66(5):688-701.</w:t>
       </w:r>
     </w:p>
     <w:p>
@@ -2636,7 +2654,7 @@
         <w:t xml:space="preserve">4. </w:t>
       </w:r>
       <w:r>
-        <w:t>Rubin DB. Estimating causal effects of treatments in randomized and nonrandomized studies. J Educ Psychol. 1974;66(5):688-701.</w:t>
+        <w:t>Austin PC, Stuart EA. Moving towards best practice when using inverse probability of treatment weighting (IPTW) using the propensity score to estimate causal treatment effects in observational studies. Stat Med. 2015;34(28):3661-3679.</w:t>
       </w:r>
     </w:p>
     <w:p>
@@ -2647,7 +2665,7 @@
         <w:t xml:space="preserve">5. </w:t>
       </w:r>
       <w:r>
-        <w:t>Austin PC, Stuart EA. Moving towards best practice when using inverse probability of treatment weighting (IPTW) using the propensity score to estimate causal treatment effects in observational studies. Stat Med. 2015;34(28):3661-3679.</w:t>
+        <w:t>VanderWeele TJ. Explanation in Causal Inference: Methods for Mediation and Interaction. Oxford University Press; 2015.</w:t>
       </w:r>
     </w:p>
     <w:p>
@@ -2658,7 +2676,7 @@
         <w:t xml:space="preserve">6. </w:t>
       </w:r>
       <w:r>
-        <w:t>Robins JM, Greenland S. Identifiability and exchangeability for direct and indirect effects. Epidemiology. 1992;3(2):143-155.</w:t>
+        <w:t>Morris JS. Israeli data: How can efficacy vs. severe disease be strong when 60% of hospitalized are vaccinated? 2021. Available from: https://www.covid-datascience.com/post/israeli-data-how-can-efficacy-vs-severe-disease-be-strong-when-60-of-hospitalized-are-vaccinated</w:t>
       </w:r>
     </w:p>
     <w:p>
@@ -2669,7 +2687,7 @@
         <w:t xml:space="preserve">7. </w:t>
       </w:r>
       <w:r>
-        <w:t>Hernán MA, Robins JM. Causal Inference: What If. Boca Raton: Chapman &amp; Hall/CRC; 2020.</w:t>
+        <w:t>Appleton DR, French NR, Vanderpump MP. Ignoring a covariate: an example of Simpson’s paradox. Am Stat. 1996;50(4):340-341.</w:t>
       </w:r>
     </w:p>
     <w:p>
@@ -2680,7 +2698,7 @@
         <w:t xml:space="preserve">8. </w:t>
       </w:r>
       <w:r>
-        <w:t>Morris S. Israeli vaccine efficacy data: a public-domain Simpson’s paradox example. 2021. Available from: https://sgmorris.net/posts/science/simpsons-paradox-israels-vaccine-data/</w:t>
+        <w:t>Julious SA, Mullee MA. Confounding and Simpson’s paradox. BMJ. 1994;309(6967):1480-1481.</w:t>
       </w:r>
     </w:p>
     <w:p>
@@ -2691,18 +2709,7 @@
         <w:t xml:space="preserve">9. </w:t>
       </w:r>
       <w:r>
-        <w:t>Appleton DR, French NR, Vanderpump MP. Ignoring a covariate: an example of Simpson’s paradox. Am Stat. 1996;50(4):340-341.</w:t>
-      </w:r>
-    </w:p>
-    <w:p>
-      <w:r>
-        <w:rPr>
-          <w:vertAlign w:val="superscript"/>
-        </w:rPr>
-        <w:t xml:space="preserve">10. </w:t>
-      </w:r>
-      <w:r>
-        <w:t>Julious SA, Mullee MA. Confounding and Simpson’s paradox. BMJ. 1994;309(6967):1480-1481.</w:t>
+        <w:t>Hernán MA, Robins JM. Causal Inference: What If. Boca Raton: Chapman &amp; Hall/CRC; 2020.</w:t>
       </w:r>
     </w:p>
     <w:sectPr>

</xml_diff>

<commit_message>
Blind main manuscript and add separate title page for peer review
Co-Authored-By: Tatsuki Onishi <bougtoir@gmail.com>
</commit_message>
<xml_diff>
--- a/results/manuscript/IONE_revised_manuscript.docx
+++ b/results/manuscript/IONE_revised_manuscript.docx
@@ -18,17 +18,6 @@
       </w:pPr>
       <w:r>
         <w:t>a simulation study of stratification-based extraction</w:t>
-      </w:r>
-    </w:p>
-    <w:p>
-      <w:pPr>
-        <w:jc w:val="center"/>
-      </w:pPr>
-      <w:r>
-        <w:rPr>
-          <w:b/>
-        </w:rPr>
-        <w:t>Onishi Tatsuki</w:t>
       </w:r>
     </w:p>
     <w:p/>

</xml_diff>

<commit_message>
Intro/Results/Discussion recovery: add W_true/W_est, risk-difference and effect-modification follow-up
Co-Authored-By: Tatsuki Onishi <bougtoir@gmail.com>
</commit_message>
<xml_diff>
--- a/results/manuscript/IONE_revised_manuscript.docx
+++ b/results/manuscript/IONE_revised_manuscript.docx
@@ -169,7 +169,7 @@
     </w:p>
     <w:p>
       <w:r>
-        <w:t>Table 1 summarises the primary phase-1 scenario (n=2000, K=5, strong Z→X trace). Extraction performance, as measured by ARI with the constructed true-Z partition, was modest for all methods. C1 values were high for most methods, reflecting between-stratum heterogeneity in observed log odds ratios, but this did not always translate into strong ATE bias reduction. Figure 1 shows the same metrics graphically.</w:t>
+        <w:t>Table 1 summarises the primary phase-1 scenario (n=2000, K=5, strong Z→X trace). Extraction performance, as measured by ARI with the constructed true-Z partition, was modest for all methods. C1 values were high for most methods, reflecting between-stratum heterogeneity in observed log odds ratios, but this did not always translate into strong ATE bias reduction on the risk-difference scale. Average within-stratum homogeneity was also low (mean W_true = 0.253, mean W_est = 0.066), indicating that the strata still contained considerable CATE variation. Figure 1 shows the same metrics graphically.</w:t>
       </w:r>
     </w:p>
     <w:tbl>
@@ -1943,7 +1943,7 @@
     </w:p>
     <w:p>
       <w:r>
-        <w:t>Bias reduction increased with stronger Z→X traces and larger sample sizes, but remained modest overall. Non-linear Z→X mappings reduced PCA-based performance but had less impact on clustering-based methods. Figure 2 illustrates the dependence of bias reduction on Z→X influence for selected methods (n=2000, K=5). Supplementary Tables S1–S4 give the full numerical results.</w:t>
+        <w:t>Bias reduction on the risk-difference scale increased with stronger Z→X traces and larger sample sizes, but remained modest overall. Effect modification by Z was therefore only partially captured by the measured proxies. Non-linear Z→X mappings reduced PCA-based performance but had less impact on clustering-based methods. Figure 2 illustrates the dependence of bias reduction on Z→X influence for selected methods (n=2000, K=5). Supplementary Tables S1–S4 give the full numerical results.</w:t>
       </w:r>
     </w:p>
     <w:p>
@@ -2569,7 +2569,7 @@
     </w:p>
     <w:p>
       <w:r>
-        <w:t>We position IONE as an exploratory diagnostic-sensitivity tool, not as a complete causal-inference workflow. The simulations show that hidden population structure can sometimes be detected and that stratified estimates can have smaller ATE bias in some scenarios, but success is strongly conditional on the confounder leaving strong traces in measured variables and on a simple, low-dimensional hidden structure. Outcome-informed methods can draw on outcome heterogeneity but require sample splitting to avoid overfitting and induced bias; outcome-free methods are more robust but lack the outcome signal. C1 and W provide transparent diagnostics, but they are not calibrated decision rules and should not replace propensity-score or regression adjustment or more comprehensive causal-inference methods</w:t>
+        <w:t>We position IONE as an exploratory diagnostic-sensitivity tool, not as a complete causal-inference workflow. The simulations show that hidden population structure—driven here by both confounding and effect modification—can sometimes be detected and that stratified estimates can have smaller ATE bias on the risk-difference scale in some scenarios, but success is strongly conditional on the confounder leaving strong traces in measured variables and on a simple, low-dimensional hidden structure. Outcome-informed methods can draw on outcome heterogeneity but require sample splitting to avoid overfitting and induced bias; outcome-free methods are more robust but lack the outcome signal. C1 and W quantify heterogeneity that underpins Simpson-type reversals, but they are not calibrated decision rules and should not replace propensity-score or regression adjustment or more comprehensive causal-inference methods</w:t>
       </w:r>
       <w:r>
         <w:rPr>

</xml_diff>